<commit_message>
docs(curriculo): atualiza versão ATS para v3 e adiciona novos bootcamps
</commit_message>
<xml_diff>
--- a/networking/Curriculo_Arthur_Tipo_01_Versao_2.66-AZUL.docx
+++ b/networking/Curriculo_Arthur_Tipo_01_Versao_2.66-AZUL.docx
@@ -1772,7 +1772,23 @@
                                   <w:rFonts w:ascii="Georgia" w:hAnsi="Georgia"/>
                                   <w:color w:val="003058"/>
                                 </w:rPr>
-                                <w:t xml:space="preserve"> infraestrutura Linux e redes). Entre 2009 e 2022, desenvolveu e administrou integralmente plataforma EAD proprietária em PHP/MySQL/Linux com </w:t>
+                                <w:t xml:space="preserve"> infraestrutura Linux e redes). E</w:t>
+                              </w:r>
+                              <w:r>
+                                <w:rPr>
+                                  <w:rFonts w:ascii="Georgia" w:hAnsi="Georgia"/>
+                                  <w:color w:val="003058"/>
+                                </w:rPr>
+                                <w:t>ntre 2009 e 2023</w:t>
+                              </w:r>
+                              <w:bookmarkStart w:id="0" w:name="_GoBack"/>
+                              <w:bookmarkEnd w:id="0"/>
+                              <w:r>
+                                <w:rPr>
+                                  <w:rFonts w:ascii="Georgia" w:hAnsi="Georgia"/>
+                                  <w:color w:val="003058"/>
+                                </w:rPr>
+                                <w:t xml:space="preserve">, desenvolveu e administrou integralmente plataforma EAD proprietária em PHP/MySQL/Linux com </w:t>
                               </w:r>
                               <w:r>
                                 <w:rPr>
@@ -2033,7 +2049,23 @@
                             <w:rFonts w:ascii="Georgia" w:hAnsi="Georgia"/>
                             <w:color w:val="003058"/>
                           </w:rPr>
-                          <w:t xml:space="preserve"> infraestrutura Linux e redes). Entre 2009 e 2022, desenvolveu e administrou integralmente plataforma EAD proprietária em PHP/MySQL/Linux com </w:t>
+                          <w:t xml:space="preserve"> infraestrutura Linux e redes). E</w:t>
+                        </w:r>
+                        <w:r>
+                          <w:rPr>
+                            <w:rFonts w:ascii="Georgia" w:hAnsi="Georgia"/>
+                            <w:color w:val="003058"/>
+                          </w:rPr>
+                          <w:t>ntre 2009 e 2023</w:t>
+                        </w:r>
+                        <w:bookmarkStart w:id="1" w:name="_GoBack"/>
+                        <w:bookmarkEnd w:id="1"/>
+                        <w:r>
+                          <w:rPr>
+                            <w:rFonts w:ascii="Georgia" w:hAnsi="Georgia"/>
+                            <w:color w:val="003058"/>
+                          </w:rPr>
+                          <w:t xml:space="preserve">, desenvolveu e administrou integralmente plataforma EAD proprietária em PHP/MySQL/Linux com </w:t>
                         </w:r>
                         <w:r>
                           <w:rPr>
@@ -13305,8 +13337,6 @@
                                 </w:rPr>
                                 <w:t xml:space="preserve"> </w:t>
                               </w:r>
-                              <w:bookmarkStart w:id="0" w:name="_GoBack"/>
-                              <w:bookmarkEnd w:id="0"/>
                               <w:r>
                                 <w:rPr>
                                   <w:rFonts w:ascii="Georgia" w:hAnsi="Georgia"/>
@@ -13571,8 +13601,6 @@
                           </w:rPr>
                           <w:t xml:space="preserve"> </w:t>
                         </w:r>
-                        <w:bookmarkStart w:id="1" w:name="_GoBack"/>
-                        <w:bookmarkEnd w:id="1"/>
                         <w:r>
                           <w:rPr>
                             <w:rFonts w:ascii="Georgia" w:hAnsi="Georgia"/>
@@ -13851,7 +13879,6 @@
                         <w:txbxContent>
                           <w:p>
                             <w:pPr>
-                              <w:jc w:val="both"/>
                               <w:rPr>
                                 <w:rFonts w:ascii="Arial Black" w:hAnsi="Arial Black"/>
                                 <w:color w:val="003058"/>
@@ -13869,7 +13896,6 @@
                           </w:p>
                           <w:p>
                             <w:pPr>
-                              <w:jc w:val="both"/>
                               <w:rPr>
                                 <w:rFonts w:ascii="Georgia" w:hAnsi="Georgia"/>
                                 <w:color w:val="003058"/>
@@ -13925,7 +13951,6 @@
                           </w:p>
                           <w:p>
                             <w:pPr>
-                              <w:jc w:val="both"/>
                               <w:rPr>
                                 <w:rFonts w:ascii="Georgia" w:hAnsi="Georgia"/>
                                 <w:color w:val="003058"/>
@@ -13936,7 +13961,6 @@
                           </w:p>
                           <w:p>
                             <w:pPr>
-                              <w:jc w:val="both"/>
                               <w:rPr>
                                 <w:rFonts w:ascii="Georgia" w:hAnsi="Georgia"/>
                                 <w:color w:val="003058"/>
@@ -14771,7 +14795,6 @@
                   <w:txbxContent>
                     <w:p>
                       <w:pPr>
-                        <w:jc w:val="both"/>
                         <w:rPr>
                           <w:rFonts w:ascii="Arial Black" w:hAnsi="Arial Black"/>
                           <w:color w:val="003058"/>
@@ -14789,7 +14812,6 @@
                     </w:p>
                     <w:p>
                       <w:pPr>
-                        <w:jc w:val="both"/>
                         <w:rPr>
                           <w:rFonts w:ascii="Georgia" w:hAnsi="Georgia"/>
                           <w:color w:val="003058"/>
@@ -14845,7 +14867,6 @@
                     </w:p>
                     <w:p>
                       <w:pPr>
-                        <w:jc w:val="both"/>
                         <w:rPr>
                           <w:rFonts w:ascii="Georgia" w:hAnsi="Georgia"/>
                           <w:color w:val="003058"/>
@@ -14856,7 +14877,6 @@
                     </w:p>
                     <w:p>
                       <w:pPr>
-                        <w:jc w:val="both"/>
                         <w:rPr>
                           <w:rFonts w:ascii="Georgia" w:hAnsi="Georgia"/>
                           <w:color w:val="003058"/>
@@ -16722,7 +16742,7 @@
         <v:path o:extrusionok="f" gradientshapeok="t" o:connecttype="rect"/>
         <o:lock v:ext="edit" aspectratio="t"/>
       </v:shapetype>
-      <v:shape id="_x0000_i1051" type="#_x0000_t75" style="width:32pt;height:32pt;visibility:visible" o:bullet="t">
+      <v:shape id="_x0000_i1052" type="#_x0000_t75" style="width:32pt;height:32pt;visibility:visible" o:bullet="t">
         <v:imagedata r:id="rId1" o:title="icons8-definir-localização-32"/>
       </v:shape>
     </w:pict>
@@ -19720,7 +19740,7 @@
 </file>
 
 <file path=customXml/itemProps1.xml><?xml version="1.0" encoding="utf-8"?>
-<ds:datastoreItem xmlns:ds="http://schemas.openxmlformats.org/officeDocument/2006/customXml" ds:itemID="{65896BA4-C2A5-4CA2-8026-C94BDE2EC836}">
+<ds:datastoreItem xmlns:ds="http://schemas.openxmlformats.org/officeDocument/2006/customXml" ds:itemID="{AD2C6634-3020-4258-971A-A861AD5B46AF}">
   <ds:schemaRefs>
     <ds:schemaRef ds:uri="http://schemas.openxmlformats.org/officeDocument/2006/bibliography"/>
   </ds:schemaRefs>

</xml_diff>